<commit_message>
- refine docx transformer and update sample module
</commit_message>
<xml_diff>
--- a/modules/demo_module_01/mod_01_content_03.docx
+++ b/modules/demo_module_01/mod_01_content_03.docx
@@ -17,6 +17,66 @@
       <w:r>
         <w:rPr/>
         <w:t>Module 1.3: Lemons</w:t>
+      </w:r>
+    </w:p>
+    <w:p>
+      <w:pPr>
+        <w:pStyle w:val="TextBody"/>
+        <w:bidi w:val="0"/>
+        <w:spacing w:before="240" w:after="120"/>
+        <w:jc w:val="left"/>
+        <w:rPr/>
+      </w:pPr>
+      <w:r>
+        <w:rPr/>
+        <w:drawing>
+          <wp:inline distT="0" distB="0" distL="0" distR="0">
+            <wp:extent cx="6120130" cy="3860800"/>
+            <wp:effectExtent l="0" t="0" r="0" b="0"/>
+            <wp:docPr id="1" name="Image1" descr=""/>
+            <wp:cNvGraphicFramePr>
+              <a:graphicFrameLocks xmlns:a="http://schemas.openxmlformats.org/drawingml/2006/main" noChangeAspect="1"/>
+            </wp:cNvGraphicFramePr>
+            <a:graphic xmlns:a="http://schemas.openxmlformats.org/drawingml/2006/main">
+              <a:graphicData uri="http://schemas.openxmlformats.org/drawingml/2006/picture">
+                <pic:pic xmlns:pic="http://schemas.openxmlformats.org/drawingml/2006/picture">
+                  <pic:nvPicPr>
+                    <pic:cNvPr id="1" name="Image1" descr=""/>
+                    <pic:cNvPicPr>
+                      <a:picLocks noChangeAspect="1" noChangeArrowheads="1"/>
+                    </pic:cNvPicPr>
+                  </pic:nvPicPr>
+                  <pic:blipFill>
+                    <a:blip r:embed="rId2"/>
+                    <a:stretch>
+                      <a:fillRect/>
+                    </a:stretch>
+                  </pic:blipFill>
+                  <pic:spPr bwMode="auto">
+                    <a:xfrm>
+                      <a:off x="0" y="0"/>
+                      <a:ext cx="6120130" cy="3860800"/>
+                    </a:xfrm>
+                    <a:prstGeom prst="rect">
+                      <a:avLst/>
+                    </a:prstGeom>
+                  </pic:spPr>
+                </pic:pic>
+              </a:graphicData>
+            </a:graphic>
+          </wp:inline>
+        </w:drawing>
+      </w:r>
+      <w:r>
+        <w:rPr/>
+        <w:br/>
+      </w:r>
+      <w:r>
+        <w:rPr>
+          <w:i/>
+          <w:iCs/>
+        </w:rPr>
+        <w:t>Image: FruitStock</w:t>
       </w:r>
     </w:p>
     <w:p>

</xml_diff>